<commit_message>
Phase 1: templates, dashboard data, Persian signatures, jump fixes, wording
- Backend: user-created message templates (versions, safe rich text, field catalog,
  preview, test-send), dashboard widget data + per-user layout, user preferences,
  stable list ordering
- Documents: Persian signature blocks (configurable signer), render_custom for
  user templates, 67-field catalog, default system templates
- Frontend: layout-shift fixes (font, skeletons, optimistic edit), course catalog
  and runs lists, wording «موتیویشن» and «انتقال اطلاعات», digit-law audit
- UX benchmark and expert review (docs/UX_BENCHMARK.md)

Co-Authored-By: Claude Sonnet 5.5 <noreply@anthropic.com>
Claude-Session: https://claude.ai/code/session_01BqMBwDVqjB6EhPxiJHn5i6
</commit_message>
<xml_diff>
--- a/templates/course_announcement.docx
+++ b/templates/course_announcement.docx
@@ -64,7 +64,7 @@
           <w:rtl/>
           <w:bCs/>
         </w:rPr>
-        <w:t>ثبت نام در دوره آموزشی | {{Farsi_Course_Name}} ({{Farsi_Type}})</w:t>
+        <w:t>ثبت‌نام در دوره آموزشی | {{Farsi_Course_Name}} ({{Farsi_Type}})</w:t>
       </w:r>
     </w:p>
     <w:p>
@@ -116,7 +116,7 @@
           <w:rFonts w:ascii="Tahoma" w:hAnsi="Tahoma" w:cs="Tahoma" w:eastAsia="Tahoma"/>
           <w:rtl/>
         </w:rPr>
-        <w:t>از آنجایی که در فرآیند نیازسنجی برای حضور در این دوره درخواست داده‌اید، خواهشمندیم حداکثر تا پایان روز {{deadline_farsi|fa}} نسبت به ثبت و تکمیل فرم درخواست (Motivation Form) در پورتال LMS اقدام نمایید.</w:t>
+        <w:t>از آنجایی که در فرآیند نیازسنجی برای حضور در این دوره درخواست داده‌اید، خواهشمندیم حداکثر تا پایان روز {{deadline_farsi|fa}} نسبت به ثبت و تکمیل فرم موتیویشن (Motivation Form) در پورتال LMS اقدام نمایید.</w:t>
       </w:r>
     </w:p>
     <w:tbl>
@@ -414,7 +414,7 @@
           <w:color w:val="0563C1"/>
           <w:rtl/>
         </w:rPr>
-        <w:t>راهنمای ثبت درخواست: {{guide_link}}</w:t>
+        <w:t>راهنمای ثبت موتیویشن: {{guide_link}}</w:t>
       </w:r>
     </w:p>
     <w:p>
@@ -440,7 +440,7 @@
           <w:rFonts w:ascii="Tahoma" w:hAnsi="Tahoma" w:cs="Tahoma" w:eastAsia="Tahoma"/>
           <w:rtl/>
         </w:rPr>
-        <w:t>•  قبل از ثبت درخواست، محتوای دوره را بررسی نمایید که مطابق با نیاز آموزشی شما باشد و با مدیر مستقیم خود در مورد انتظاراتی که پس از گذراندن این دوره خواهند داشت صحبت نمایید.</w:t>
+        <w:t>•  قبل از ثبت موتیویشن، محتوای دوره را بررسی نمایید که مطابق با نیاز آموزشی شما باشد و با مدیر مستقیم خود در مورد انتظاراتی که پس از گذراندن این دوره خواهند داشت صحبت نمایید.</w:t>
       </w:r>
     </w:p>
     <w:p>
@@ -453,7 +453,7 @@
           <w:rFonts w:ascii="Tahoma" w:hAnsi="Tahoma" w:cs="Tahoma" w:eastAsia="Tahoma"/>
           <w:rtl/>
         </w:rPr>
-        <w:t>•  حضور در دوره‌های آموزشی شامل پرداخت اضافه‌کار نمی‌شود؛ در صورت عدم حضور در شرکت در ساعات اداری، شما می‌توانید به جای ثبت مرخصی در سیستم محاسبه کارکرد، «ماموریت ساعتی درون‌شهری» ثبت نمایید.</w:t>
+        <w:t>•  حضور در دوره‌های آموزشی شامل پرداخت اضافه‌کار نمی‌شود؛ در صورت عدم حضور در شرکت در ساعات اداری، شما می‌توانید به جای ثبت مرخصی در سیستم محاسبه کارکرد، «مأموریت ساعتی درون‌شهری» ثبت نمایید.</w:t>
       </w:r>
     </w:p>
     <w:p>
@@ -464,6 +464,8 @@
     <w:p>
       <w:pPr>
         <w:spacing w:after="20" w:before="0"/>
+        <w:keepNext/>
+        <w:keepLines/>
         <w:bidi/>
       </w:pPr>
       <w:r>
@@ -477,6 +479,23 @@
     <w:p>
       <w:pPr>
         <w:spacing w:after="20" w:before="0"/>
+        <w:keepNext/>
+        <w:keepLines/>
+        <w:bidi/>
+      </w:pPr>
+      <w:r>
+        <w:rPr>
+          <w:rFonts w:ascii="Tahoma" w:hAnsi="Tahoma" w:cs="Tahoma" w:eastAsia="Tahoma"/>
+          <w:rtl/>
+        </w:rPr>
+        <w:t>[[SIGNATURE_IMAGE]]</w:t>
+      </w:r>
+    </w:p>
+    <w:p>
+      <w:pPr>
+        <w:spacing w:after="20" w:before="0"/>
+        <w:keepNext/>
+        <w:keepLines/>
         <w:bidi/>
       </w:pPr>
       <w:r>
@@ -486,12 +505,14 @@
           <w:rtl/>
           <w:bCs/>
         </w:rPr>
-        <w:t>تیم تعلق خاطر کارکنان</w:t>
+        <w:t>{{signer_name_fa}}</w:t>
       </w:r>
     </w:p>
     <w:p>
       <w:pPr>
         <w:spacing w:after="20" w:before="0"/>
+        <w:keepNext/>
+        <w:keepLines/>
         <w:bidi/>
       </w:pPr>
       <w:r>
@@ -499,7 +520,39 @@
           <w:rFonts w:ascii="Tahoma" w:hAnsi="Tahoma" w:cs="Tahoma" w:eastAsia="Tahoma"/>
           <w:rtl/>
         </w:rPr>
-        <w:t>منابع انسانی</w:t>
+        <w:t>{{signer_title_fa}}</w:t>
+      </w:r>
+    </w:p>
+    <w:p>
+      <w:pPr>
+        <w:spacing w:after="20" w:before="0"/>
+        <w:keepNext/>
+        <w:keepLines/>
+        <w:bidi/>
+      </w:pPr>
+      <w:r>
+        <w:rPr>
+          <w:rFonts w:ascii="Tahoma" w:hAnsi="Tahoma" w:cs="Tahoma" w:eastAsia="Tahoma"/>
+          <w:b/>
+          <w:rtl/>
+          <w:bCs/>
+        </w:rPr>
+        <w:t>{{unit_fa}}</w:t>
+      </w:r>
+    </w:p>
+    <w:p>
+      <w:pPr>
+        <w:spacing w:after="20" w:before="0"/>
+        <w:keepNext w:val="0"/>
+        <w:keepLines/>
+        <w:bidi/>
+      </w:pPr>
+      <w:r>
+        <w:rPr>
+          <w:rFonts w:ascii="Tahoma" w:hAnsi="Tahoma" w:cs="Tahoma" w:eastAsia="Tahoma"/>
+          <w:rtl/>
+        </w:rPr>
+        <w:t>{{department_fa}}</w:t>
       </w:r>
     </w:p>
     <w:p>
@@ -895,6 +948,8 @@
     </w:p>
     <w:p>
       <w:pPr>
+        <w:keepNext/>
+        <w:keepLines/>
         <w:spacing w:after="20" w:before="0"/>
       </w:pPr>
       <w:r>
@@ -904,17 +959,19 @@
     </w:p>
     <w:p>
       <w:pPr>
+        <w:keepNext/>
+        <w:keepLines/>
         <w:spacing w:after="20" w:before="0"/>
       </w:pPr>
       <w:r>
-        <w:rPr>
-          <w:b/>
-        </w:rPr>
+        <w:rPr/>
         <w:t>Employee Engagement Team</w:t>
       </w:r>
     </w:p>
     <w:p>
       <w:pPr>
+        <w:keepNext w:val="0"/>
+        <w:keepLines/>
         <w:spacing w:after="20" w:before="0"/>
       </w:pPr>
       <w:r>

</xml_diff>